<commit_message>
aggiunte cose dal drive
</commit_message>
<xml_diff>
--- a/1 User Case/UC Gestire i Turni.docx
+++ b/1 User Case/UC Gestire i Turni.docx
@@ -1,6 +1,6 @@
 
 <file path=word/document.xml><?xml version="1.0" encoding="utf-8"?>
-<w:document xmlns:mc="http://schemas.openxmlformats.org/markup-compatibility/2006" xmlns:o="urn:schemas-microsoft-com:office:office" xmlns:r="http://schemas.openxmlformats.org/officeDocument/2006/relationships" xmlns:m="http://schemas.openxmlformats.org/officeDocument/2006/math" xmlns:v="urn:schemas-microsoft-com:vml" xmlns:wp="http://schemas.openxmlformats.org/drawingml/2006/wordprocessingDrawing" xmlns:w10="urn:schemas-microsoft-com:office:word" xmlns:w="http://schemas.openxmlformats.org/wordprocessingml/2006/main" xmlns:wne="http://schemas.microsoft.com/office/word/2006/wordml" xmlns:sl="http://schemas.openxmlformats.org/schemaLibrary/2006/main" xmlns:a="http://schemas.openxmlformats.org/drawingml/2006/main" xmlns:pic="http://schemas.openxmlformats.org/drawingml/2006/picture" xmlns:c="http://schemas.openxmlformats.org/drawingml/2006/chart" xmlns:lc="http://schemas.openxmlformats.org/drawingml/2006/lockedCanvas" xmlns:dgm="http://schemas.openxmlformats.org/drawingml/2006/diagram" xmlns:wps="http://schemas.microsoft.com/office/word/2010/wordprocessingShape" xmlns:wpg="http://schemas.microsoft.com/office/word/2010/wordprocessingGroup" xmlns:w14="http://schemas.microsoft.com/office/word/2010/wordml" xmlns:w15="http://schemas.microsoft.com/office/word/2012/wordml">
+<w:document xmlns:mc="http://schemas.openxmlformats.org/markup-compatibility/2006" xmlns:o="urn:schemas-microsoft-com:office:office" xmlns:r="http://schemas.openxmlformats.org/officeDocument/2006/relationships" xmlns:m="http://schemas.openxmlformats.org/officeDocument/2006/math" xmlns:v="urn:schemas-microsoft-com:vml" xmlns:wp="http://schemas.openxmlformats.org/drawingml/2006/wordprocessingDrawing" xmlns:w10="urn:schemas-microsoft-com:office:word" xmlns:w="http://schemas.openxmlformats.org/wordprocessingml/2006/main" xmlns:wne="http://schemas.microsoft.com/office/word/2006/wordml" xmlns:sl="http://schemas.openxmlformats.org/schemaLibrary/2006/main" xmlns:a="http://schemas.openxmlformats.org/drawingml/2006/main" xmlns:pic="http://schemas.openxmlformats.org/drawingml/2006/picture" xmlns:c="http://schemas.openxmlformats.org/drawingml/2006/chart" xmlns:lc="http://schemas.openxmlformats.org/drawingml/2006/lockedCanvas" xmlns:dgm="http://schemas.openxmlformats.org/drawingml/2006/diagram" xmlns:wps="http://schemas.microsoft.com/office/word/2010/wordprocessingShape" xmlns:wpg="http://schemas.microsoft.com/office/word/2010/wordprocessingGroup" xmlns:w14="http://schemas.microsoft.com/office/word/2010/wordml" xmlns:w15="http://schemas.microsoft.com/office/word/2012/wordml" xmlns:w16="http://schemas.microsoft.com/office/word/2018/wordml" xmlns:w16cex="http://schemas.microsoft.com/office/word/2018/wordml/cex" xmlns:w16cid="http://schemas.microsoft.com/office/word/2016/wordml/cid" xmlns:cr="http://schemas.microsoft.com/office/comments/2020/reactions">
   <w:body>
     <w:p>
       <w:pPr>
@@ -17,6 +17,432 @@
         <w:ind w:left="100" w:firstLine="0"/>
         <w:jc w:val="center"/>
         <w:rPr>
+          <w:rFonts w:ascii="Fredericka the Great" w:cs="Fredericka the Great" w:eastAsia="Fredericka the Great" w:hAnsi="Fredericka the Great"/>
+          <w:b w:val="0"/>
+          <w:color w:val="009a96"/>
+        </w:rPr>
+      </w:pPr>
+      <w:bookmarkStart w:colFirst="0" w:colLast="0" w:name="_n5t8muflzf3t" w:id="0"/>
+      <w:bookmarkEnd w:id="0"/>
+      <w:r>
+        <w:rPr>
+          <w:rtl w:val="0"/>
+        </w:rPr>
+      </w:r>
+    </w:p>
+    <w:p>
+      <w:pPr>
+        <w:pStyle w:val="Title"/>
+        <w:widowControl w:val="0"/>
+        <w:pBdr>
+          <w:top w:color="auto" w:space="0" w:sz="0" w:val="none"/>
+          <w:left w:color="auto" w:space="0" w:sz="0" w:val="none"/>
+          <w:bottom w:color="auto" w:space="0" w:sz="0" w:val="none"/>
+          <w:right w:color="auto" w:space="0" w:sz="0" w:val="none"/>
+          <w:between w:color="auto" w:space="0" w:sz="0" w:val="none"/>
+        </w:pBdr>
+        <w:spacing w:after="0" w:before="0" w:line="276" w:lineRule="auto"/>
+        <w:ind w:left="100" w:firstLine="0"/>
+        <w:jc w:val="center"/>
+        <w:rPr>
+          <w:rFonts w:ascii="Fredericka the Great" w:cs="Fredericka the Great" w:eastAsia="Fredericka the Great" w:hAnsi="Fredericka the Great"/>
+          <w:b w:val="0"/>
+          <w:color w:val="009a96"/>
+        </w:rPr>
+      </w:pPr>
+      <w:bookmarkStart w:colFirst="0" w:colLast="0" w:name="_wwkslquqt4a2" w:id="1"/>
+      <w:bookmarkEnd w:id="1"/>
+      <w:r>
+        <w:rPr>
+          <w:rtl w:val="0"/>
+        </w:rPr>
+      </w:r>
+    </w:p>
+    <w:p>
+      <w:pPr>
+        <w:pStyle w:val="Title"/>
+        <w:widowControl w:val="0"/>
+        <w:pBdr>
+          <w:top w:color="auto" w:space="0" w:sz="0" w:val="none"/>
+          <w:left w:color="auto" w:space="0" w:sz="0" w:val="none"/>
+          <w:bottom w:color="auto" w:space="0" w:sz="0" w:val="none"/>
+          <w:right w:color="auto" w:space="0" w:sz="0" w:val="none"/>
+          <w:between w:color="auto" w:space="0" w:sz="0" w:val="none"/>
+        </w:pBdr>
+        <w:spacing w:after="0" w:before="0" w:line="276" w:lineRule="auto"/>
+        <w:ind w:left="100" w:firstLine="0"/>
+        <w:jc w:val="center"/>
+        <w:rPr>
+          <w:rFonts w:ascii="Fredericka the Great" w:cs="Fredericka the Great" w:eastAsia="Fredericka the Great" w:hAnsi="Fredericka the Great"/>
+          <w:b w:val="0"/>
+          <w:color w:val="009a96"/>
+        </w:rPr>
+      </w:pPr>
+      <w:bookmarkStart w:colFirst="0" w:colLast="0" w:name="_pmpzq0h4d3a9" w:id="2"/>
+      <w:bookmarkEnd w:id="2"/>
+      <w:r>
+        <w:rPr>
+          <w:rtl w:val="0"/>
+        </w:rPr>
+      </w:r>
+    </w:p>
+    <w:p>
+      <w:pPr>
+        <w:pStyle w:val="Title"/>
+        <w:widowControl w:val="0"/>
+        <w:pBdr>
+          <w:top w:color="auto" w:space="0" w:sz="0" w:val="none"/>
+          <w:left w:color="auto" w:space="0" w:sz="0" w:val="none"/>
+          <w:bottom w:color="auto" w:space="0" w:sz="0" w:val="none"/>
+          <w:right w:color="auto" w:space="0" w:sz="0" w:val="none"/>
+          <w:between w:color="auto" w:space="0" w:sz="0" w:val="none"/>
+        </w:pBdr>
+        <w:spacing w:after="0" w:before="0" w:line="276" w:lineRule="auto"/>
+        <w:ind w:left="100" w:firstLine="0"/>
+        <w:jc w:val="center"/>
+        <w:rPr>
+          <w:rFonts w:ascii="Lexend" w:cs="Lexend" w:eastAsia="Lexend" w:hAnsi="Lexend"/>
+          <w:color w:val="009a96"/>
+        </w:rPr>
+      </w:pPr>
+      <w:bookmarkStart w:colFirst="0" w:colLast="0" w:name="_t4tx14brb7nl" w:id="3"/>
+      <w:bookmarkEnd w:id="3"/>
+      <w:r>
+        <w:rPr>
+          <w:rFonts w:ascii="Lexend" w:cs="Lexend" w:eastAsia="Lexend" w:hAnsi="Lexend"/>
+          <w:color w:val="009a96"/>
+          <w:rtl w:val="0"/>
+        </w:rPr>
+        <w:t xml:space="preserve">Progetto Sviluppo Applicazioni Software</w:t>
+      </w:r>
+    </w:p>
+    <w:p>
+      <w:pPr>
+        <w:pStyle w:val="Title"/>
+        <w:widowControl w:val="0"/>
+        <w:pBdr>
+          <w:top w:color="auto" w:space="0" w:sz="0" w:val="none"/>
+          <w:left w:color="auto" w:space="0" w:sz="0" w:val="none"/>
+          <w:bottom w:color="auto" w:space="0" w:sz="0" w:val="none"/>
+          <w:right w:color="auto" w:space="0" w:sz="0" w:val="none"/>
+          <w:between w:color="auto" w:space="0" w:sz="0" w:val="none"/>
+        </w:pBdr>
+        <w:spacing w:after="0" w:before="0" w:line="276" w:lineRule="auto"/>
+        <w:ind w:left="100" w:firstLine="0"/>
+        <w:jc w:val="center"/>
+        <w:rPr/>
+      </w:pPr>
+      <w:bookmarkStart w:colFirst="0" w:colLast="0" w:name="_lnfd0xua7ku" w:id="4"/>
+      <w:bookmarkEnd w:id="4"/>
+      <w:r>
+        <w:rPr>
+          <w:rFonts w:ascii="Lexend" w:cs="Lexend" w:eastAsia="Lexend" w:hAnsi="Lexend"/>
+          <w:color w:val="009a96"/>
+          <w:sz w:val="54"/>
+          <w:szCs w:val="54"/>
+          <w:rtl w:val="0"/>
+        </w:rPr>
+        <w:t xml:space="preserve">“Gestire i turni della cucina”</w:t>
+      </w:r>
+      <w:r>
+        <w:rPr>
+          <w:rtl w:val="0"/>
+        </w:rPr>
+      </w:r>
+    </w:p>
+    <w:p>
+      <w:pPr>
+        <w:pStyle w:val="Title"/>
+        <w:widowControl w:val="0"/>
+        <w:pBdr>
+          <w:top w:color="auto" w:space="0" w:sz="0" w:val="none"/>
+          <w:left w:color="auto" w:space="0" w:sz="0" w:val="none"/>
+          <w:bottom w:color="auto" w:space="0" w:sz="0" w:val="none"/>
+          <w:right w:color="auto" w:space="0" w:sz="0" w:val="none"/>
+          <w:between w:color="auto" w:space="0" w:sz="0" w:val="none"/>
+        </w:pBdr>
+        <w:spacing w:after="0" w:before="0" w:line="276" w:lineRule="auto"/>
+        <w:ind w:left="100" w:firstLine="0"/>
+        <w:jc w:val="center"/>
+        <w:rPr>
+          <w:rFonts w:ascii="Lexend" w:cs="Lexend" w:eastAsia="Lexend" w:hAnsi="Lexend"/>
+          <w:b w:val="0"/>
+          <w:color w:val="009a96"/>
+          <w:sz w:val="48"/>
+          <w:szCs w:val="48"/>
+        </w:rPr>
+      </w:pPr>
+      <w:bookmarkStart w:colFirst="0" w:colLast="0" w:name="_2fcna1n05sz0" w:id="5"/>
+      <w:bookmarkEnd w:id="5"/>
+      <w:r>
+        <w:rPr>
+          <w:rFonts w:ascii="Lexend" w:cs="Lexend" w:eastAsia="Lexend" w:hAnsi="Lexend"/>
+          <w:b w:val="0"/>
+          <w:color w:val="009a96"/>
+          <w:sz w:val="48"/>
+          <w:szCs w:val="48"/>
+          <w:rtl w:val="0"/>
+        </w:rPr>
+        <w:t xml:space="preserve">anno accademico 2023/24</w:t>
+      </w:r>
+    </w:p>
+    <w:p>
+      <w:pPr>
+        <w:pStyle w:val="Title"/>
+        <w:widowControl w:val="0"/>
+        <w:pBdr>
+          <w:top w:color="auto" w:space="0" w:sz="0" w:val="none"/>
+          <w:left w:color="auto" w:space="0" w:sz="0" w:val="none"/>
+          <w:bottom w:color="auto" w:space="0" w:sz="0" w:val="none"/>
+          <w:right w:color="auto" w:space="0" w:sz="0" w:val="none"/>
+          <w:between w:color="auto" w:space="0" w:sz="0" w:val="none"/>
+        </w:pBdr>
+        <w:spacing w:after="0" w:before="0" w:line="276" w:lineRule="auto"/>
+        <w:ind w:left="100" w:firstLine="0"/>
+        <w:jc w:val="center"/>
+        <w:rPr>
+          <w:rFonts w:ascii="Fredericka the Great" w:cs="Fredericka the Great" w:eastAsia="Fredericka the Great" w:hAnsi="Fredericka the Great"/>
+          <w:b w:val="0"/>
+          <w:color w:val="009a96"/>
+        </w:rPr>
+      </w:pPr>
+      <w:bookmarkStart w:colFirst="0" w:colLast="0" w:name="_yv06dvoka4f4" w:id="6"/>
+      <w:bookmarkEnd w:id="6"/>
+      <w:r>
+        <w:rPr>
+          <w:rtl w:val="0"/>
+        </w:rPr>
+      </w:r>
+    </w:p>
+    <w:p>
+      <w:pPr>
+        <w:rPr/>
+      </w:pPr>
+      <w:r>
+        <w:rPr>
+          <w:rtl w:val="0"/>
+        </w:rPr>
+      </w:r>
+    </w:p>
+    <w:p>
+      <w:pPr>
+        <w:rPr/>
+      </w:pPr>
+      <w:r>
+        <w:rPr>
+          <w:rtl w:val="0"/>
+        </w:rPr>
+      </w:r>
+    </w:p>
+    <w:p>
+      <w:pPr>
+        <w:rPr/>
+      </w:pPr>
+      <w:r>
+        <w:rPr>
+          <w:rtl w:val="0"/>
+        </w:rPr>
+      </w:r>
+    </w:p>
+    <w:p>
+      <w:pPr>
+        <w:pStyle w:val="Title"/>
+        <w:widowControl w:val="0"/>
+        <w:pBdr>
+          <w:top w:color="auto" w:space="0" w:sz="0" w:val="none"/>
+          <w:left w:color="auto" w:space="0" w:sz="0" w:val="none"/>
+          <w:bottom w:color="auto" w:space="0" w:sz="0" w:val="none"/>
+          <w:right w:color="auto" w:space="0" w:sz="0" w:val="none"/>
+          <w:between w:color="auto" w:space="0" w:sz="0" w:val="none"/>
+        </w:pBdr>
+        <w:spacing w:after="0" w:before="0" w:line="276" w:lineRule="auto"/>
+        <w:ind w:left="100" w:firstLine="0"/>
+        <w:jc w:val="center"/>
+        <w:rPr>
+          <w:rFonts w:ascii="Lexend" w:cs="Lexend" w:eastAsia="Lexend" w:hAnsi="Lexend"/>
+          <w:b w:val="0"/>
+          <w:color w:val="009a96"/>
+          <w:sz w:val="34"/>
+          <w:szCs w:val="34"/>
+        </w:rPr>
+      </w:pPr>
+      <w:bookmarkStart w:colFirst="0" w:colLast="0" w:name="_xtxok8vakes" w:id="7"/>
+      <w:bookmarkEnd w:id="7"/>
+      <w:r>
+        <w:rPr>
+          <w:rFonts w:ascii="Lexend" w:cs="Lexend" w:eastAsia="Lexend" w:hAnsi="Lexend"/>
+          <w:b w:val="0"/>
+          <w:color w:val="009a96"/>
+          <w:sz w:val="34"/>
+          <w:szCs w:val="34"/>
+          <w:rtl w:val="0"/>
+        </w:rPr>
+        <w:t xml:space="preserve">Balzano Edoardo (977286) </w:t>
+      </w:r>
+    </w:p>
+    <w:p>
+      <w:pPr>
+        <w:pStyle w:val="Title"/>
+        <w:widowControl w:val="0"/>
+        <w:pBdr>
+          <w:top w:color="auto" w:space="0" w:sz="0" w:val="none"/>
+          <w:left w:color="auto" w:space="0" w:sz="0" w:val="none"/>
+          <w:bottom w:color="auto" w:space="0" w:sz="0" w:val="none"/>
+          <w:right w:color="auto" w:space="0" w:sz="0" w:val="none"/>
+          <w:between w:color="auto" w:space="0" w:sz="0" w:val="none"/>
+        </w:pBdr>
+        <w:spacing w:after="0" w:before="0" w:line="276" w:lineRule="auto"/>
+        <w:ind w:left="100" w:firstLine="0"/>
+        <w:jc w:val="center"/>
+        <w:rPr>
+          <w:rFonts w:ascii="Lexend" w:cs="Lexend" w:eastAsia="Lexend" w:hAnsi="Lexend"/>
+          <w:b w:val="0"/>
+          <w:color w:val="009a96"/>
+          <w:sz w:val="34"/>
+          <w:szCs w:val="34"/>
+        </w:rPr>
+      </w:pPr>
+      <w:bookmarkStart w:colFirst="0" w:colLast="0" w:name="_t98p9wtn829i" w:id="8"/>
+      <w:bookmarkEnd w:id="8"/>
+      <w:r>
+        <w:rPr>
+          <w:rFonts w:ascii="Lexend" w:cs="Lexend" w:eastAsia="Lexend" w:hAnsi="Lexend"/>
+          <w:b w:val="0"/>
+          <w:color w:val="009a96"/>
+          <w:sz w:val="34"/>
+          <w:szCs w:val="34"/>
+          <w:rtl w:val="0"/>
+        </w:rPr>
+        <w:t xml:space="preserve">Ariobazzone Antonino (975880)</w:t>
+      </w:r>
+    </w:p>
+    <w:p>
+      <w:pPr>
+        <w:rPr/>
+      </w:pPr>
+      <w:r>
+        <w:rPr>
+          <w:rtl w:val="0"/>
+        </w:rPr>
+        <w:tab/>
+      </w:r>
+      <w:r>
+        <w:rPr>
+          <w:rtl w:val="0"/>
+        </w:rPr>
+      </w:r>
+    </w:p>
+    <w:p>
+      <w:pPr>
+        <w:pStyle w:val="Title"/>
+        <w:widowControl w:val="0"/>
+        <w:pBdr>
+          <w:top w:color="auto" w:space="0" w:sz="0" w:val="none"/>
+          <w:left w:color="auto" w:space="0" w:sz="0" w:val="none"/>
+          <w:bottom w:color="auto" w:space="0" w:sz="0" w:val="none"/>
+          <w:right w:color="auto" w:space="0" w:sz="0" w:val="none"/>
+          <w:between w:color="auto" w:space="0" w:sz="0" w:val="none"/>
+        </w:pBdr>
+        <w:spacing w:after="0" w:before="0" w:line="276" w:lineRule="auto"/>
+        <w:ind w:left="100" w:firstLine="0"/>
+        <w:jc w:val="center"/>
+        <w:rPr>
+          <w:rFonts w:ascii="Fredericka the Great" w:cs="Fredericka the Great" w:eastAsia="Fredericka the Great" w:hAnsi="Fredericka the Great"/>
+          <w:b w:val="0"/>
+          <w:color w:val="009a96"/>
+        </w:rPr>
+      </w:pPr>
+      <w:bookmarkStart w:colFirst="0" w:colLast="0" w:name="_iv7cqvumdfdf" w:id="9"/>
+      <w:bookmarkEnd w:id="9"/>
+      <w:r>
+        <w:rPr>
+          <w:rtl w:val="0"/>
+        </w:rPr>
+      </w:r>
+    </w:p>
+    <w:p>
+      <w:pPr>
+        <w:rPr/>
+      </w:pPr>
+      <w:r>
+        <w:rPr>
+          <w:rtl w:val="0"/>
+        </w:rPr>
+      </w:r>
+    </w:p>
+    <w:p>
+      <w:pPr>
+        <w:pStyle w:val="Title"/>
+        <w:widowControl w:val="0"/>
+        <w:pBdr>
+          <w:top w:color="auto" w:space="0" w:sz="0" w:val="none"/>
+          <w:left w:color="auto" w:space="0" w:sz="0" w:val="none"/>
+          <w:bottom w:color="auto" w:space="0" w:sz="0" w:val="none"/>
+          <w:right w:color="auto" w:space="0" w:sz="0" w:val="none"/>
+          <w:between w:color="auto" w:space="0" w:sz="0" w:val="none"/>
+        </w:pBdr>
+        <w:spacing w:after="0" w:before="0" w:line="276" w:lineRule="auto"/>
+        <w:ind w:left="0" w:firstLine="0"/>
+        <w:jc w:val="left"/>
+        <w:rPr>
+          <w:rFonts w:ascii="Fredericka the Great" w:cs="Fredericka the Great" w:eastAsia="Fredericka the Great" w:hAnsi="Fredericka the Great"/>
+          <w:b w:val="0"/>
+          <w:color w:val="009a96"/>
+        </w:rPr>
+      </w:pPr>
+      <w:bookmarkStart w:colFirst="0" w:colLast="0" w:name="_iizcgtp2zo2c" w:id="10"/>
+      <w:bookmarkEnd w:id="10"/>
+      <w:r>
+        <w:rPr>
+          <w:rtl w:val="0"/>
+        </w:rPr>
+      </w:r>
+    </w:p>
+    <w:p>
+      <w:pPr>
+        <w:rPr/>
+      </w:pPr>
+      <w:r>
+        <w:rPr>
+          <w:rtl w:val="0"/>
+        </w:rPr>
+      </w:r>
+    </w:p>
+    <w:p>
+      <w:pPr>
+        <w:rPr/>
+      </w:pPr>
+      <w:r>
+        <w:rPr>
+          <w:rtl w:val="0"/>
+        </w:rPr>
+      </w:r>
+    </w:p>
+    <w:p>
+      <w:pPr>
+        <w:rPr/>
+      </w:pPr>
+      <w:r>
+        <w:rPr>
+          <w:rtl w:val="0"/>
+        </w:rPr>
+      </w:r>
+    </w:p>
+    <w:p>
+      <w:pPr>
+        <w:pStyle w:val="Title"/>
+        <w:widowControl w:val="0"/>
+        <w:pBdr>
+          <w:top w:color="auto" w:space="0" w:sz="0" w:val="none"/>
+          <w:left w:color="auto" w:space="0" w:sz="0" w:val="none"/>
+          <w:bottom w:color="auto" w:space="0" w:sz="0" w:val="none"/>
+          <w:right w:color="auto" w:space="0" w:sz="0" w:val="none"/>
+          <w:between w:color="auto" w:space="0" w:sz="0" w:val="none"/>
+        </w:pBdr>
+        <w:spacing w:after="0" w:before="0" w:line="276" w:lineRule="auto"/>
+        <w:ind w:left="100" w:firstLine="0"/>
+        <w:jc w:val="center"/>
+        <w:rPr>
           <w:rFonts w:ascii="Arial" w:cs="Arial" w:eastAsia="Arial" w:hAnsi="Arial"/>
           <w:b w:val="1"/>
           <w:color w:val="2e75b5"/>
@@ -24,8 +450,8 @@
           <w:szCs w:val="44"/>
         </w:rPr>
       </w:pPr>
-      <w:bookmarkStart w:colFirst="0" w:colLast="0" w:name="_st6ijngpefka" w:id="0"/>
-      <w:bookmarkEnd w:id="0"/>
+      <w:bookmarkStart w:colFirst="0" w:colLast="0" w:name="_st6ijngpefka" w:id="11"/>
+      <w:bookmarkEnd w:id="11"/>
       <w:r>
         <w:rPr>
           <w:rFonts w:ascii="Fredericka the Great" w:cs="Fredericka the Great" w:eastAsia="Fredericka the Great" w:hAnsi="Fredericka the Great"/>
@@ -9413,11 +9839,11 @@
 </file>
 
 <file path=word/numbering.xml><?xml version="1.0" encoding="utf-8"?>
-<w:numbering xmlns:mc="http://schemas.openxmlformats.org/markup-compatibility/2006" xmlns:o="urn:schemas-microsoft-com:office:office" xmlns:r="http://schemas.openxmlformats.org/officeDocument/2006/relationships" xmlns:m="http://schemas.openxmlformats.org/officeDocument/2006/math" xmlns:v="urn:schemas-microsoft-com:vml" xmlns:wp="http://schemas.openxmlformats.org/drawingml/2006/wordprocessingDrawing" xmlns:w10="urn:schemas-microsoft-com:office:word" xmlns:w="http://schemas.openxmlformats.org/wordprocessingml/2006/main" xmlns:wne="http://schemas.microsoft.com/office/word/2006/wordml" xmlns:sl="http://schemas.openxmlformats.org/schemaLibrary/2006/main" xmlns:a="http://schemas.openxmlformats.org/drawingml/2006/main" xmlns:pic="http://schemas.openxmlformats.org/drawingml/2006/picture" xmlns:c="http://schemas.openxmlformats.org/drawingml/2006/chart" xmlns:lc="http://schemas.openxmlformats.org/drawingml/2006/lockedCanvas" xmlns:dgm="http://schemas.openxmlformats.org/drawingml/2006/diagram" xmlns:wps="http://schemas.microsoft.com/office/word/2010/wordprocessingShape" xmlns:wpg="http://schemas.microsoft.com/office/word/2010/wordprocessingGroup" xmlns:w14="http://schemas.microsoft.com/office/word/2010/wordml" xmlns:w15="http://schemas.microsoft.com/office/word/2012/wordml"/>
+<w:numbering xmlns:mc="http://schemas.openxmlformats.org/markup-compatibility/2006" xmlns:o="urn:schemas-microsoft-com:office:office" xmlns:r="http://schemas.openxmlformats.org/officeDocument/2006/relationships" xmlns:m="http://schemas.openxmlformats.org/officeDocument/2006/math" xmlns:v="urn:schemas-microsoft-com:vml" xmlns:wp="http://schemas.openxmlformats.org/drawingml/2006/wordprocessingDrawing" xmlns:w10="urn:schemas-microsoft-com:office:word" xmlns:w="http://schemas.openxmlformats.org/wordprocessingml/2006/main" xmlns:wne="http://schemas.microsoft.com/office/word/2006/wordml" xmlns:sl="http://schemas.openxmlformats.org/schemaLibrary/2006/main" xmlns:a="http://schemas.openxmlformats.org/drawingml/2006/main" xmlns:pic="http://schemas.openxmlformats.org/drawingml/2006/picture" xmlns:c="http://schemas.openxmlformats.org/drawingml/2006/chart" xmlns:lc="http://schemas.openxmlformats.org/drawingml/2006/lockedCanvas" xmlns:dgm="http://schemas.openxmlformats.org/drawingml/2006/diagram" xmlns:wps="http://schemas.microsoft.com/office/word/2010/wordprocessingShape" xmlns:wpg="http://schemas.microsoft.com/office/word/2010/wordprocessingGroup" xmlns:w14="http://schemas.microsoft.com/office/word/2010/wordml" xmlns:w15="http://schemas.microsoft.com/office/word/2012/wordml" xmlns:w16="http://schemas.microsoft.com/office/word/2018/wordml" xmlns:w16cex="http://schemas.microsoft.com/office/word/2018/wordml/cex" xmlns:w16cid="http://schemas.microsoft.com/office/word/2016/wordml/cid" xmlns:cr="http://schemas.microsoft.com/office/comments/2020/reactions"/>
 </file>
 
 <file path=word/styles.xml><?xml version="1.0" encoding="utf-8"?>
-<w:styles xmlns:mc="http://schemas.openxmlformats.org/markup-compatibility/2006" xmlns:o="urn:schemas-microsoft-com:office:office" xmlns:r="http://schemas.openxmlformats.org/officeDocument/2006/relationships" xmlns:m="http://schemas.openxmlformats.org/officeDocument/2006/math" xmlns:v="urn:schemas-microsoft-com:vml" xmlns:wp="http://schemas.openxmlformats.org/drawingml/2006/wordprocessingDrawing" xmlns:w10="urn:schemas-microsoft-com:office:word" xmlns:w="http://schemas.openxmlformats.org/wordprocessingml/2006/main" xmlns:wne="http://schemas.microsoft.com/office/word/2006/wordml" xmlns:sl="http://schemas.openxmlformats.org/schemaLibrary/2006/main" xmlns:a="http://schemas.openxmlformats.org/drawingml/2006/main" xmlns:pic="http://schemas.openxmlformats.org/drawingml/2006/picture" xmlns:c="http://schemas.openxmlformats.org/drawingml/2006/chart" xmlns:lc="http://schemas.openxmlformats.org/drawingml/2006/lockedCanvas" xmlns:dgm="http://schemas.openxmlformats.org/drawingml/2006/diagram" xmlns:wps="http://schemas.microsoft.com/office/word/2010/wordprocessingShape" xmlns:wpg="http://schemas.microsoft.com/office/word/2010/wordprocessingGroup" xmlns:w14="http://schemas.microsoft.com/office/word/2010/wordml" xmlns:w15="http://schemas.microsoft.com/office/word/2012/wordml">
+<w:styles xmlns:mc="http://schemas.openxmlformats.org/markup-compatibility/2006" xmlns:o="urn:schemas-microsoft-com:office:office" xmlns:r="http://schemas.openxmlformats.org/officeDocument/2006/relationships" xmlns:m="http://schemas.openxmlformats.org/officeDocument/2006/math" xmlns:v="urn:schemas-microsoft-com:vml" xmlns:wp="http://schemas.openxmlformats.org/drawingml/2006/wordprocessingDrawing" xmlns:w10="urn:schemas-microsoft-com:office:word" xmlns:w="http://schemas.openxmlformats.org/wordprocessingml/2006/main" xmlns:wne="http://schemas.microsoft.com/office/word/2006/wordml" xmlns:sl="http://schemas.openxmlformats.org/schemaLibrary/2006/main" xmlns:a="http://schemas.openxmlformats.org/drawingml/2006/main" xmlns:pic="http://schemas.openxmlformats.org/drawingml/2006/picture" xmlns:c="http://schemas.openxmlformats.org/drawingml/2006/chart" xmlns:lc="http://schemas.openxmlformats.org/drawingml/2006/lockedCanvas" xmlns:dgm="http://schemas.openxmlformats.org/drawingml/2006/diagram" xmlns:wps="http://schemas.microsoft.com/office/word/2010/wordprocessingShape" xmlns:wpg="http://schemas.microsoft.com/office/word/2010/wordprocessingGroup" xmlns:w14="http://schemas.microsoft.com/office/word/2010/wordml" xmlns:w15="http://schemas.microsoft.com/office/word/2012/wordml" xmlns:w16="http://schemas.microsoft.com/office/word/2018/wordml" xmlns:w16cex="http://schemas.microsoft.com/office/word/2018/wordml/cex" xmlns:w16cid="http://schemas.microsoft.com/office/word/2016/wordml/cid" xmlns:cr="http://schemas.microsoft.com/office/comments/2020/reactions">
   <w:docDefaults>
     <w:rPrDefault>
       <w:rPr>

</xml_diff>